<commit_message>
POC add generic boolean properties
</commit_message>
<xml_diff>
--- a/HaemophilusWeb/ReportTemplates/Meningo/Nativmaterial v2.docx
+++ b/HaemophilusWeb/ReportTemplates/Meningo/Nativmaterial v2.docx
@@ -1105,6 +1105,159 @@
     </w:p>
     <w:p>
       <w:pPr>
+        <w:widowControl w:val="0"/>
+        <w:tabs>
+          <w:tab w:val="left" w:pos="90"/>
+        </w:tabs>
+        <w:autoSpaceDE w:val="0"/>
+        <w:autoSpaceDN w:val="0"/>
+        <w:adjustRightInd w:val="0"/>
+        <w:spacing w:before="171"/>
+        <w:rPr>
+          <w:rFonts w:ascii="Arial" w:hAnsi="Arial" w:cs="Arial"/>
+        </w:rPr>
+      </w:pPr>
+      <w:r>
+        <w:rPr>
+          <w:rFonts w:ascii="Arial" w:hAnsi="Arial" w:cs="Arial"/>
+        </w:rPr>
+        <w:t>{#</w:t>
+      </w:r>
+      <w:r>
+        <w:rPr>
+          <w:rFonts w:ascii="Arial" w:hAnsi="Arial" w:cs="Arial"/>
+        </w:rPr>
+        <w:t>NativeMaterialInterpretation_04</w:t>
+      </w:r>
+      <w:r>
+        <w:rPr>
+          <w:rFonts w:ascii="Arial" w:hAnsi="Arial" w:cs="Arial"/>
+        </w:rPr>
+        <w:t>}</w:t>
+      </w:r>
+      <w:r>
+        <w:rPr>
+          <w:rFonts w:ascii="Arial" w:hAnsi="Arial" w:cs="Arial"/>
+        </w:rPr>
+        <w:t>Treffer</w:t>
+      </w:r>
+      <w:r>
+        <w:rPr>
+          <w:rFonts w:ascii="Arial" w:hAnsi="Arial" w:cs="Arial"/>
+          <w:color w:val="31849B"/>
+        </w:rPr>
+        <w:t xml:space="preserve">: </w:t>
+      </w:r>
+      <w:r>
+        <w:rPr>
+          <w:rFonts w:ascii="Arial" w:hAnsi="Arial" w:cs="Arial"/>
+          <w:color w:val="31849B"/>
+        </w:rPr>
+        <w:t>Native Regel 4</w:t>
+      </w:r>
+      <w:r>
+        <w:rPr>
+          <w:rFonts w:ascii="Arial" w:hAnsi="Arial" w:cs="Arial"/>
+        </w:rPr>
+        <w:t>{</w:t>
+      </w:r>
+      <w:r>
+        <w:rPr>
+          <w:rFonts w:ascii="Arial" w:hAnsi="Arial" w:cs="Arial"/>
+        </w:rPr>
+        <w:t>/</w:t>
+      </w:r>
+      <w:r>
+        <w:rPr>
+          <w:rFonts w:ascii="Arial" w:hAnsi="Arial" w:cs="Arial"/>
+        </w:rPr>
+        <w:t>NativeMaterialInterpretation_04</w:t>
+      </w:r>
+      <w:r>
+        <w:rPr>
+          <w:rFonts w:ascii="Arial" w:hAnsi="Arial" w:cs="Arial"/>
+        </w:rPr>
+        <w:t>}</w:t>
+      </w:r>
+    </w:p>
+    <w:p>
+      <w:pPr>
+        <w:widowControl w:val="0"/>
+        <w:tabs>
+          <w:tab w:val="left" w:pos="90"/>
+        </w:tabs>
+        <w:autoSpaceDE w:val="0"/>
+        <w:autoSpaceDN w:val="0"/>
+        <w:adjustRightInd w:val="0"/>
+        <w:spacing w:before="171"/>
+        <w:rPr>
+          <w:rFonts w:ascii="Arial" w:hAnsi="Arial" w:cs="Arial"/>
+        </w:rPr>
+      </w:pPr>
+      <w:r>
+        <w:rPr>
+          <w:rFonts w:ascii="Arial" w:hAnsi="Arial" w:cs="Arial"/>
+        </w:rPr>
+        <w:t>{#</w:t>
+      </w:r>
+      <w:r>
+        <w:rPr>
+          <w:rFonts w:ascii="Arial" w:hAnsi="Arial" w:cs="Arial"/>
+        </w:rPr>
+        <w:t>NoRule</w:t>
+      </w:r>
+      <w:r>
+        <w:rPr>
+          <w:rFonts w:ascii="Arial" w:hAnsi="Arial" w:cs="Arial"/>
+        </w:rPr>
+        <w:t>}</w:t>
+      </w:r>
+      <w:r>
+        <w:rPr>
+          <w:rFonts w:ascii="Arial" w:hAnsi="Arial" w:cs="Arial"/>
+          <w:color w:val="C00000"/>
+        </w:rPr>
+        <w:t>Keine passende Interpretationsregel</w:t>
+      </w:r>
+      <w:r>
+        <w:rPr>
+          <w:rFonts w:ascii="Arial" w:hAnsi="Arial" w:cs="Arial"/>
+        </w:rPr>
+        <w:t>{/NoRule}</w:t>
+      </w:r>
+    </w:p>
+    <w:p>
+      <w:pPr>
+        <w:widowControl w:val="0"/>
+        <w:tabs>
+          <w:tab w:val="left" w:pos="90"/>
+        </w:tabs>
+        <w:autoSpaceDE w:val="0"/>
+        <w:autoSpaceDN w:val="0"/>
+        <w:adjustRightInd w:val="0"/>
+        <w:spacing w:before="171"/>
+        <w:rPr>
+          <w:rFonts w:ascii="Arial" w:hAnsi="Arial" w:cs="Arial"/>
+        </w:rPr>
+      </w:pPr>
+    </w:p>
+    <w:p>
+      <w:pPr>
+        <w:widowControl w:val="0"/>
+        <w:tabs>
+          <w:tab w:val="left" w:pos="90"/>
+        </w:tabs>
+        <w:autoSpaceDE w:val="0"/>
+        <w:autoSpaceDN w:val="0"/>
+        <w:adjustRightInd w:val="0"/>
+        <w:spacing w:before="171"/>
+        <w:rPr>
+          <w:rFonts w:ascii="Arial" w:hAnsi="Arial" w:cs="Arial"/>
+        </w:rPr>
+      </w:pPr>
+    </w:p>
+    <w:p>
+      <w:pPr>
         <w:rPr>
           <w:rFonts w:ascii="Arial" w:hAnsi="Arial" w:cs="Arial"/>
         </w:rPr>
@@ -1911,7 +2064,7 @@
           <v:path o:extrusionok="f" gradientshapeok="t" o:connecttype="rect"/>
           <o:lock v:ext="edit" aspectratio="t"/>
         </v:shapetype>
-        <v:shape id="Grafik 5" o:spid="_x0000_s1110" type="#_x0000_t75" alt="nrzmhi_logo_500" style="position:absolute;margin-left:385.15pt;margin-top:2.25pt;width:63.4pt;height:63.4pt;z-index:-5;visibility:visible;mso-wrap-style:square;mso-width-percent:0;mso-height-percent:0;mso-wrap-distance-left:9pt;mso-wrap-distance-top:0;mso-wrap-distance-right:9pt;mso-wrap-distance-bottom:0;mso-position-horizontal:absolute;mso-position-horizontal-relative:text;mso-position-vertical:absolute;mso-position-vertical-relative:text;mso-width-percent:0;mso-height-percent:0;mso-width-relative:page;mso-height-relative:page">
+        <v:shape id="Grafik 5" o:spid="_x0000_s1110" type="#_x0000_t75" alt="nrzmhi_logo_500" style="position:absolute;margin-left:385.15pt;margin-top:2.25pt;width:63.4pt;height:63.4pt;z-index:-3;visibility:visible;mso-wrap-style:square;mso-width-percent:0;mso-height-percent:0;mso-wrap-distance-left:9pt;mso-wrap-distance-top:0;mso-wrap-distance-right:9pt;mso-wrap-distance-bottom:0;mso-position-horizontal:absolute;mso-position-horizontal-relative:text;mso-position-vertical:absolute;mso-position-vertical-relative:text;mso-width-percent:0;mso-height-percent:0;mso-width-relative:page;mso-height-relative:page">
           <v:imagedata r:id="rId1" o:title="nrzmhi_logo_500"/>
         </v:shape>
       </w:pict>
@@ -2052,7 +2205,7 @@
           <v:stroke joinstyle="miter"/>
           <v:path gradientshapeok="t" o:connecttype="rect"/>
         </v:shapetype>
-        <v:shape id="Textfeld 2" o:spid="_x0000_s1122" type="#_x0000_t202" style="position:absolute;margin-left:284.2pt;margin-top:12.05pt;width:90.7pt;height:90.7pt;z-index:-4;visibility:visible;mso-wrap-distance-left:9pt;mso-wrap-distance-top:3.6pt;mso-wrap-distance-right:9pt;mso-wrap-distance-bottom:3.6pt;mso-position-horizontal-relative:text;mso-position-vertical-relative:text;mso-width-relative:margin;mso-height-relative:margin;v-text-anchor:top" stroked="f">
+        <v:shape id="Textfeld 2" o:spid="_x0000_s1122" type="#_x0000_t202" style="position:absolute;margin-left:284.2pt;margin-top:12.05pt;width:90.7pt;height:90.7pt;z-index:-2;visibility:visible;mso-wrap-distance-left:9pt;mso-wrap-distance-top:3.6pt;mso-wrap-distance-right:9pt;mso-wrap-distance-bottom:3.6pt;mso-position-horizontal-relative:text;mso-position-vertical-relative:text;mso-width-relative:margin;mso-height-relative:margin;v-text-anchor:top" stroked="f">
           <v:textbox>
             <w:txbxContent>
               <w:p>
@@ -2112,7 +2265,7 @@
         <w:noProof/>
       </w:rPr>
       <w:pict w14:anchorId="7F1A6F5B">
-        <v:shape id="Grafik 1" o:spid="_x0000_s1157" type="#_x0000_t75" alt="RKI_Logo-NRZKL-Deu_RGB-1.JPG" style="position:absolute;margin-left:449.25pt;margin-top:6.75pt;width:55pt;height:55pt;z-index:6;visibility:visible;mso-wrap-style:square;mso-width-percent:0;mso-height-percent:0;mso-wrap-distance-left:9pt;mso-wrap-distance-top:0;mso-wrap-distance-right:9pt;mso-wrap-distance-bottom:0;mso-position-horizontal:absolute;mso-position-horizontal-relative:text;mso-position-vertical:absolute;mso-position-vertical-relative:text;mso-width-percent:0;mso-height-percent:0;mso-width-relative:page;mso-height-relative:page" stroked="t" strokecolor="white">
+        <v:shape id="Grafik 1" o:spid="_x0000_s1157" type="#_x0000_t75" alt="RKI_Logo-NRZKL-Deu_RGB-1.JPG" style="position:absolute;margin-left:449.25pt;margin-top:6.75pt;width:55pt;height:55pt;z-index:4;visibility:visible;mso-wrap-style:square;mso-width-percent:0;mso-height-percent:0;mso-wrap-distance-left:9pt;mso-wrap-distance-top:0;mso-wrap-distance-right:9pt;mso-wrap-distance-bottom:0;mso-position-horizontal:absolute;mso-position-horizontal-relative:text;mso-position-vertical:absolute;mso-position-vertical-relative:text;mso-width-percent:0;mso-height-percent:0;mso-width-relative:page;mso-height-relative:page" stroked="t" strokecolor="white">
           <v:imagedata r:id="rId2" o:title="RKI_Logo-NRZKL-Deu_RGB-1"/>
         </v:shape>
       </w:pict>
@@ -2233,7 +2386,7 @@
         <w:noProof/>
       </w:rPr>
       <w:pict w14:anchorId="27A39B59">
-        <v:shape id="Textfeld 3" o:spid="_x0000_s1156" type="#_x0000_t202" style="position:absolute;margin-left:364.1pt;margin-top:2.3pt;width:156.8pt;height:304.25pt;z-index:7;visibility:visible;mso-wrap-style:square;mso-width-percent:0;mso-height-percent:0;mso-wrap-distance-left:9pt;mso-wrap-distance-top:0;mso-wrap-distance-right:9pt;mso-wrap-distance-bottom:0;mso-position-horizontal-relative:text;mso-position-vertical-relative:text;mso-width-percent:0;mso-height-percent:0;mso-width-relative:page;mso-height-relative:page;v-text-anchor:top" o:gfxdata="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" stroked="f">
+        <v:shape id="Textfeld 3" o:spid="_x0000_s1156" type="#_x0000_t202" style="position:absolute;margin-left:364.1pt;margin-top:2.3pt;width:156.8pt;height:304.25pt;z-index:5;visibility:visible;mso-wrap-style:square;mso-width-percent:0;mso-height-percent:0;mso-wrap-distance-left:9pt;mso-wrap-distance-top:0;mso-wrap-distance-right:9pt;mso-wrap-distance-bottom:0;mso-position-horizontal-relative:text;mso-position-vertical-relative:text;mso-width-percent:0;mso-height-percent:0;mso-width-relative:page;mso-height-relative:page;v-text-anchor:top" o:gfxdata="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" stroked="f">
           <v:textbox style="mso-next-textbox:#Textfeld 3">
             <w:txbxContent>
               <w:p>
@@ -3272,7 +3425,6 @@
   <w:style w:type="character" w:default="1" w:styleId="Absatz-Standardschriftart">
     <w:name w:val="Default Paragraph Font"/>
     <w:uiPriority w:val="1"/>
-    <w:semiHidden/>
     <w:unhideWhenUsed/>
   </w:style>
   <w:style w:type="table" w:default="1" w:styleId="NormaleTabelle">

</xml_diff>